<commit_message>
Fix PyMC section ordering, Bayes factor/estimator explanations, and drop graph-only version notes
Script 1: reorder PyMC narration to match actual notebook cell sequence
(diagram -> sampling -> trace plot -> sufficiency Q&A), reframe MCMC
sampling rationale as a deliberate sanity check rather than a false
"no closed form" claim, restore missing detail in the Bayes-factor
Chat answer, state the actual computed Bayes factor value (38.52) and
what it means, fully answer the point-estimate vs. Bayes-estimator
question, and remove version notes that only describe graph rendering
differences (keeping the WAIC->LOO methodology note). Script 2: same
graph-only version-note cleanup. Add Word (.docx) versions of all
three scripts alongside the existing PDFs.

Co-Authored-By: Claude Sonnet 5 <noreply@anthropic.com>
</commit_message>
<xml_diff>
--- a/1_bayes_vs_frequentist/script_1_bayes_vs_frequentist.docx
+++ b/1_bayes_vs_frequentist/script_1_bayes_vs_frequentist.docx
@@ -524,7 +524,7 @@
           <w:sz w:val="25"/>
           <w:rtl/>
         </w:rPr>
-        <w:t>ארבע שרשראות רצות כאן במקביל, בלתי תלויות, כל אחת מנקודת התחלה אחרת, ואם כולן מתכנסות לאותה התפלגות זו עדות חזקה שאנחנו רואים את הפוסטריורי האמיתי ולא תקלה מקומית. לכל שרשרת יש שלב חימום שנזרק ולא נספר, ורק אחריו מתחילים לספור את הדגימות שנשמרות בפועל.</w:t>
+        <w:t>יש כאן ארבע שרשראות בלתי תלויות שרצות במקביל, כל אחת מנקודת התחלה אחרת, ואם כולן מתכנסות לאותה התפלגות זו עדות חזקה שאנחנו רואים את הפוסטריורי האמיתי ולא תקלה מקומית. לכל שרשרת יש שלב חימום שנזרק ולא נספר, ורק אחריו מתחילים לספור את הדגימות שנשמרות בפועל.</w:t>
       </w:r>
     </w:p>
     <w:p>
@@ -541,7 +541,7 @@
           <w:sz w:val="25"/>
           <w:rtl/>
         </w:rPr>
-        <w:t>גרף מסלול הדגימה כאן: ציר ה-X הוא מספר הדגימה, ציר ה-Y הוא הערך שנדגם, וארבעה קווי צבע, אחד לכל שרשרת, שצריכים להיראות כמו רעש חסר מבנה שקופץ סביב אותו אזור ולחפוף כמעט לגמרי, לא כמו מגמה או תקיעות במקום אחד. הערת גרסה: בגרסה הישנה של הספרייה, הפונקציה הזאת הייתה מציגה גם גרף צפיפות, לא רק מסלול. בגרסה שמותקנת כאן היא מציגה רק את המסלול, וזה בסדר, כי את הצפיפות כבר ראינו בנפרד קודם.</w:t>
+        <w:t>בגרף מסלול הדגימה כאן, ציר ה-X הוא מספר הדגימה, ציר ה-Y הוא הערך שנדגם, וארבעה קווי צבע, אחד לכל שרשרת. שרשרת שמתפקדת טוב נראית כמו רעש אקראי צפוף סביב אותו פס צר לאורך כל הציר, בלי לזוז בהדרגה לכיוון מסוים (מגמה) ובלי להישאר תקועה על אותו ערך לאורך זמן. חשוב לא פחות: ארבעת הקווים צריכים להיראות כאילו הם רועשים באותו אזור בדיוק וחופפים זה על זה כמעט לגמרי, וזה הסימן החזותי שכל השרשראות, למרות שהתחילו מנקודות שונות, הגיעו לאותה מסקנה.</w:t>
       </w:r>
     </w:p>
     <w:p>
@@ -678,7 +678,7 @@
           <w:sz w:val="25"/>
           <w:rtl/>
         </w:rPr>
-        <w:t>אחרי שיש לנו גם דגימות מהפוסטריורי המלא, אפשר סוף סוף להשוות ישירות בין רווח האמון הבייסאני לשלושת רווחי הסמך הקלאסיים. הגרף הזה מראה את הפוסטריורי דרך עקומת צפיפות, קו לאומדן הנקודה, ותחום מוצלל לרווח האמון של 95 אחוז. הערת גרסה: הקוד המקורי מציג את זה בפונקציה שכבר לא קיימת בגרסה הנוכחית של הספרייה, ומוזגה לתוך גרסה כללית יותר שנותנת בדיוק אותה תמונה.</w:t>
+        <w:t>אחרי שיש לנו גם דגימות מהפוסטריורי המלא, אפשר סוף סוף להשוות ישירות בין רווח האמון הבייסאני לשלושת רווחי הסמך הקלאסיים. הגרף הזה מראה את הפוסטריורי דרך עקומת צפיפות, קו לאומדן הנקודה, ותחום מוצלל לרווח האמון של 95 אחוז.</w:t>
       </w:r>
     </w:p>
     <w:p>
@@ -695,7 +695,7 @@
           <w:sz w:val="25"/>
           <w:rtl/>
         </w:rPr>
-        <w:t>לצד הגרף יש גם טבלת סיכום סטנדרטית של arviz, עם כמה עמודות אבחון שיחזרו לאורך כל המחברת וכדאי להסביר פעם אחת כאן: ess_bulk ו-ess_tail הם גודל המדגם האפקטיבי, כלומר כמה דגימות בלתי-תלויות שוות-ערך יש לנו בפועל ולא כמה דגימות יש על הנייר; ו-r_hat הוא מדד ההתכנסות של גלמן-רובין, שמשווה את השונות בין השרשראות השונות לשונות בתוך כל שרשרת בנפרד. ערך קרוב מאוד לאחת, כמו שרואים כאן, אומר ששרשראות שהתחילו מנקודות התחלה שונות התכנסו לאותה התפלגות בדיוק; ערך גבוה משמעותית מאחת הוא אזהרה שהדגימה לא באמת התכנסה ואי אפשר לסמוך על התוצאה.</w:t>
+        <w:t>בתא שאחרי הגרף מופיעה טבלת סיכום סטנדרטית של arviz, שמראה עבור p את הממוצע הפוסטריורי, סטיית התקן, וגבולות רווח האמון, לצד כמה עמודות אבחון שיחזרו לאורך כל המחברת וכדאי להסביר פעם אחת כאן: ess_bulk ו-ess_tail הם גודל המדגם האפקטיבי, כלומר כמה דגימות בלתי-תלויות שוות-ערך יש לנו בפועל מתוך דגימת ה-MCMC של p (זו הדגימה שהגישה הבייסאנית מבצעת), ולא כמה דגימות יש על הנייר; ו-r_hat הוא מדד ההתכנסות של גלמן-רובין, שמשווה את השונות בין השרשראות השונות לשונות בתוך כל שרשרת בנפרד. ערך קרוב מאוד לאחת, כמו שרואים כאן, אומר ששרשראות שהתחילו מנקודות התחלה שונות התכנסו לאותה התפלגות בדיוק; ערך גבוה משמעותית מאחת הוא אזהרה שדגימת p לא באמת התכנסה ואי אפשר לסמוך על התוצאה. מתחת לטבלה הזו, באותו פלט, מודפסים גם ארבעת רווחי הסמך שכבר חישבנו.</w:t>
       </w:r>
     </w:p>
     <w:p>
@@ -712,7 +712,7 @@
           <w:sz w:val="25"/>
           <w:rtl/>
         </w:rPr>
-        <w:t>עכשיו הרגע המרכזי: כל ארבעת הרווחים, שלושת הקלאסיים ורווח האמון הבייסאני, מופיעים אחד מתחת לשני באותו גרף, כל אחד כקו אופקי באורך הרווח שלו. עבור המחוז הזה, עם מדגם בגודל בינוני ופריור שטוח, כל הארבעה כמעט זהים לגמרי, בדיוק כמו שהתאוריה הא-סימפטוטית מנבאת. אבל, כפי שראינו קודם, זה לא תמיד המצב במחוזות קטנים.</w:t>
+        <w:t>עכשיו הרגע המרכזי: כל ארבעת הרווחים, שלושת הקלאסיים ורווח האמון הבייסאני, מופיעים אחד מתחת לשני באותו גרף. כל אחד מהם מצויר כקו אופקי שמתחיל בגבול התחתון של אותו רווח ומסתיים בגבול העליון שלו, כך שאורך הקו על הגרף מראה חזותית כמה רחב הרווח הזה. עבור המחוז הזה, עם מדגם בגודל בינוני ופריור שטוח, כל הארבעה כמעט זהים לגמרי, בדיוק כמו שהתאוריה הא-סימפטוטית מנבאת. אבל, כפי שראינו קודם, זה לא תמיד המצב במחוזות קטנים.</w:t>
       </w:r>
     </w:p>
     <w:p>
@@ -746,7 +746,7 @@
           <w:sz w:val="25"/>
           <w:rtl/>
         </w:rPr>
-        <w:t>עד כה השאלה הייתה כמה גבוה אחוז ההצלחה. עכשיו שאלה מסוג אחר: האם המחוז שלנו שונה מהממוצע הארצי, שיוצא סביב 44 אחוז. בגישה הקלאסית, מבחן בינומי מדויק, שנותן ערך מובהקות זעיר. שאלתי את הצ'אט מה הגישה הבייסאנית המקבילה:</w:t>
+        <w:t>עד כה השאלה הייתה כמה גבוה אחוז ההצלחה. עכשיו שאלה מסוג אחר: האם המחוז שלנו שונה מהממוצע הארצי, שיוצא סביב 44 אחוז? כמו שאתם יכולים לראות, הגישה הקלאסית עונה על זה עם מבחן בינומי מדויק, שנותן כאן ערך מובהקות זעיר. שאלתי את הצ'אט מה הגישה הבייסאנית המקבילה:</w:t>
       </w:r>
     </w:p>
     <w:p>
@@ -779,7 +779,7 @@
           <w:sz w:val="25"/>
           <w:rtl/>
         </w:rPr>
-        <w:t>והוא ענה שפקטור בייס מחושב דרך יחס בין שתי צפיפויות, בשיטה שנקראת יחס Savage-Dickey: משווים את צפיפות הפוסטריורי בערך הייחוס לצפיפות הפריור באותה נקודה בדיוק. H0 כאן הוא שאחוז ההצלחה של המחוז שווה לממוצע הארצי, ו-H1 שהוא שונה ממנו.</w:t>
+        <w:t>והוא ענה שהגישה הבייסאנית המקבילה היא פקטור בייס, שמודד כמה פעמים יותר סביר לראות את הנתונים שראינו תחת השערה אחת לעומת השנייה. H0 כאן הוא שאחוז ההצלחה של המחוז שווה לממוצע הארצי, ו-H1 שהוא שונה ממנו. הוא מחושב בשיטה שנקראת יחס Savage-Dickey: משווים את צפיפות הפוסטריורי לצפיפות הפריור, שתיהן בדיוק בערך הייחוס, כלומר בנקודה שמייצגת את H0, הממוצע הארצי.</w:t>
       </w:r>
     </w:p>
     <w:p>
@@ -796,7 +796,7 @@
           <w:sz w:val="25"/>
           <w:rtl/>
         </w:rPr>
-        <w:t>בגרף הזה: ציר ה-X הוא אחוז ההצלחה וציר ה-Y הוא צפיפות ההסתברות, עם שתי עקומות על אותם צירים, אחת לפריור ואחת לפוסטריורי, וקו אנכי מסמן את ערך הייחוס, הממוצע הארצי. פקטור בייס הוא בדיוק היחס בין גובה שתי העקומות באותה נקודה על הקו האנכי, וזה בדיוק הערך שהכותרת של הגרף מדפיסה.</w:t>
+        <w:t>כדי להמחיש את פקטור בייס, בגרף הזה: ציר ה-X הוא אחוז ההצלחה וציר ה-Y הוא צפיפות ההסתברות, עם שתי עקומות על אותם צירים, אחת לפריור ואחת לפוסטריורי, וקו אנכי מסמן את ערך הייחוס. פקטור בייס הוא בדיוק היחס בין גובה שתי העקומות באותה נקודה על הקו האנכי, וזה הערך שהכותרת של הגרף מדפיסה: כאן הוא יוצא 38.52, כלומר הנתונים שראינו סבירים פי כ-38.5 יותר תחת ההשערה שהמחוז שונה מהממוצע הארצי לעומת ההשערה שהוא שווה לו.</w:t>
       </w:r>
     </w:p>
     <w:p>
@@ -930,7 +930,7 @@
           <w:sz w:val="25"/>
           <w:rtl/>
         </w:rPr>
-        <w:t>והוא ענה שאומדן בייס ממזער אובדן צפוי לפי פונקציית אובדן שבוחרים: הממוצע הפוסטריורי ממזער שגיאה ריבועית, והחציון ממזער שגיאה מוחלטת.</w:t>
+        <w:t>והוא ענה שאומדן נקודה הוא בסך הכול כל מספר בודד שמסכם את הפוסטריורי, ואילו אומדן בייס הוא מונח ממוקד יותר: הערך שממזער את האובדן הפוסטריורי הצפוי, לפי פונקציית אובדן שבוחרים מראש. הממוצע הפוסטריורי ממזער שגיאה ריבועית, החציון ממזער שגיאה מוחלטת, והשכיח ממזער אובדן אפס-אחד. שלושת האומדנים האלה יוצאים כמעט זהים כשהפוסטריורי סימטרי וחד-שיאי, כמו כאן, אבל יכולים להיבדל משמעותית כשהוא מוטה, למשל במחוז עם מעט מאוד תלמידים ואחוז הצלחה קרוב לאפס, שם הבטא הפוסטריורית יוצאת מוטה בבירור.</w:t>
       </w:r>
     </w:p>
     <w:p>
@@ -1557,7 +1557,7 @@
           <w:sz w:val="25"/>
           <w:rtl/>
         </w:rPr>
-        <w:t>אותה טבלה מוצגת גם כגרף. ציר X הוא הפרש ה-ELPD, מדד נראות-החיזוי של כל מודל על תצפיות שהוצאו ממנו, כשערך גבוה יותר אומר חיזוי טוב יותר; כל מודל מקבל שורה משלו על ציר Y. המודל המדורג ראשון, ההיררכי, יושב בדיוק על קו מקווקו אנכי באפס: הוא קו הייחוס שכל שאר המודלים נמדדים ביחסיו. המודל העצמאי מסומן בנקודה על ההפרש שלו, סביב מינוס אחת, עם קו אופקי סביבה שהוא טווח השגיאה התקנית של אותו הפרש, וכיוון שהקו הזה חוצה את קו האפס, ההבדל בין שני המודלים קטן ביחס לרעש שלו, בדיוק כמו שכבר ראינו במספרים בטבלה. שווה לציין גם: הכותרת "higher is better" שמופיעה על הגרף היא לא תוספת שלי, היא מגיעה מובנית מתוך הפונקציה עצמה בגרסת arviz המותקנת כאן, עוד סימן לכך שהגרסה החדשה של הספרייה לא רק שינתה את המדד מ-WAIC ל-LOO, אלא גם שכתבה מחדש את כל מנגנון הציור של הפונקציה הזאת.</w:t>
+        <w:t>אותה טבלה מוצגת גם כגרף. ציר X הוא הפרש ה-ELPD, מדד נראות-החיזוי של כל מודל על תצפיות שהוצאו ממנו, כשערך גבוה יותר אומר חיזוי טוב יותר; כל מודל מקבל שורה משלו על ציר Y. המודל המדורג ראשון, ההיררכי, יושב בדיוק על קו מקווקו אנכי באפס: הוא קו הייחוס שכל שאר המודלים נמדדים ביחסיו. המודל העצמאי מסומן בנקודה על ההפרש שלו, סביב מינוס אחת, עם קו אופקי סביבה שהוא טווח השגיאה התקנית של אותו הפרש, וכיוון שהקו הזה חוצה את קו האפס, ההבדל בין שני המודלים קטן ביחס לרעש שלו, בדיוק כמו שכבר ראינו במספרים בטבלה.</w:t>
       </w:r>
     </w:p>
     <w:p>

</xml_diff>

<commit_message>
Audit script_1 against notebook cell order and Chat Q&A completeness
Fix two more cell-order violations found by full audit: the Beta
prior/posterior graph was narrated after the "why is Beta conjugate"
Chat question instead of before it (matching the notebook's own
forward reference to "the curve we'll see in a moment"), and the
fitted mu/nu numeric values were narrated after the Beta(mu,nu)
parametrization Chat question instead of before it. Also close three
Chat Q&A completeness gaps found by comparing every question against
its answer: the Bayes-factor answer never explained what a p-value
is (so "how does it compare to a classical test" went unanswered),
the Beta(mu,nu) answer never said why alpha/beta are the worse
choice (so "instead of" was never justified), and the posterior
predictive answer dropped the point that it's strictly more spread
out than sampling at a single parameter estimate.

Co-Authored-By: Claude Sonnet 5 <noreply@anthropic.com>
</commit_message>
<xml_diff>
--- a/1_bayes_vs_frequentist/script_1_bayes_vs_frequentist.docx
+++ b/1_bayes_vs_frequentist/script_1_bayes_vs_frequentist.docx
@@ -389,7 +389,24 @@
           <w:sz w:val="25"/>
           <w:rtl/>
         </w:rPr>
-        <w:t>שאלתי את הצ'אט למה דווקא התפלגות בטא היא הבחירה הטבעית כאן:</w:t>
+        <w:t>הגרף כאן מראה שתי עקומות: הפריור השטוח, ולידו הפוסטריורי אחרי שראינו את הנתונים, ועליהן קו מקווקו אנכי שמסמן את p_hat, אותו אומדן קלאסי שכבר חישבנו קודם. חשוב להבין מה שתי העקומות האלה בעצם אומרות, לא רק איך הן נראות. הקו השטוח של הפריור אומר: לפני שראיתי אפילו תלמיד אחד מהמחוז הזה, כל ערך אפשרי נראה לי סביר באותה מידה בדיוק, אין לי שום מושג אם המחוז מצליח או נכשל. העקומה הצרה והממוקדת של הפוסטריורי אומרת: אחרי שראיתי את הנתונים, אני עכשיו כמעט בטוחה שאחוז ההצלחה האמיתי של המחוז נמצא באזור צר סביב 0.62, וערכים קיצוניים הפכו בלתי סבירים כמעט לגמרי. שווה לשים לב שהקו המקווקו של p_hat נופל כמעט בדיוק בשיא הפוסטריורי: זה לא מקרי, אלא בדיוק מה שקורה כשיש מספיק נתונים ופריור חלש, כמו כאן. זו בדיוק המשמעות של עדכון אמונות לפי נתונים: התמונה עברה מבורות מוחלטת לביטחון ממוקד, וזה בדיוק מה שהגרף מראה חזותית.</w:t>
+      </w:r>
+    </w:p>
+    <w:p>
+      <w:pPr>
+        <w:bidi/>
+        <w:spacing w:after="160" w:before="0"/>
+        <w:jc w:val="both"/>
+      </w:pPr>
+      <w:r>
+        <w:rPr>
+          <w:rFonts w:ascii="David" w:hAnsi="David" w:cs="David" w:eastAsia="David"/>
+          <w:b w:val="0"/>
+          <w:i w:val="0"/>
+          <w:sz w:val="25"/>
+          <w:rtl/>
+        </w:rPr>
+        <w:t>אחרי שראיתי את העדכון הזה קורה בפועל, שאלתי את הצ'אט למה דווקא התפלגות בטא היא הבחירה הטבעית כאן:</w:t>
       </w:r>
     </w:p>
     <w:p>
@@ -423,23 +440,6 @@
           <w:rtl/>
         </w:rPr>
         <w:t>והוא ענה שזה נובע מכך שהצורה האלגברית של הלייקליהוד הבינומי זהה לצורה של צפיפות בטא, ולכן הכפל ביניהן רק מוסיף מעריכים. זה בדיוק מה שנקרא פריור צמוד: אחרי שרואים כמה הצלחות מתוך כמה ניסיונות, הפוסטריורי הוא שוב בטא, רק עם פרמטרים מעודכנים בחיבור פשוט, בלי שום אינטגרציה נומרית.</w:t>
-      </w:r>
-    </w:p>
-    <w:p>
-      <w:pPr>
-        <w:bidi/>
-        <w:spacing w:after="160" w:before="0"/>
-        <w:jc w:val="both"/>
-      </w:pPr>
-      <w:r>
-        <w:rPr>
-          <w:rFonts w:ascii="David" w:hAnsi="David" w:cs="David" w:eastAsia="David"/>
-          <w:b w:val="0"/>
-          <w:i w:val="0"/>
-          <w:sz w:val="25"/>
-          <w:rtl/>
-        </w:rPr>
-        <w:t>הגרף כאן מראה שתי עקומות: הפריור השטוח, ולידו הפוסטריורי אחרי שראינו את הנתונים, ועליהן קו מקווקו אנכי שמסמן את p_hat, אותו אומדן קלאסי שכבר חישבנו קודם. חשוב להבין מה שתי העקומות האלה בעצם אומרות, לא רק איך הן נראות. הקו השטוח של הפריור אומר: לפני שראיתי אפילו תלמיד אחד מהמחוז הזה, כל ערך אפשרי נראה לי סביר באותה מידה בדיוק, אין לי שום מושג אם המחוז מצליח או נכשל. העקומה הצרה והממוקדת של הפוסטריורי אומרת: אחרי שראיתי את הנתונים, אני עכשיו כמעט בטוחה שאחוז ההצלחה האמיתי של המחוז נמצא באזור צר סביב 0.62, וערכים קיצוניים הפכו בלתי סבירים כמעט לגמרי. שווה לשים לב שהקו המקווקו של p_hat נופל כמעט בדיוק בשיא הפוסטריורי: זה לא מקרי, אלא בדיוק מה שקורה כשיש מספיק נתונים ופריור חלש, כמו כאן. זו בדיוק המשמעות של עדכון אמונות לפי נתונים: התמונה עברה מבורות מוחלטת לביטחון ממוקד, וזה בדיוק מה שהגרף מראה חזותית.</w:t>
       </w:r>
     </w:p>
     <w:p>
@@ -779,7 +779,7 @@
           <w:sz w:val="25"/>
           <w:rtl/>
         </w:rPr>
-        <w:t>והוא ענה שהגישה הבייסאנית המקבילה היא פקטור בייס, שמודד כמה פעמים יותר סביר לראות את הנתונים שראינו תחת השערה אחת לעומת השנייה. H0 כאן הוא שאחוז ההצלחה של המחוז שווה לממוצע הארצי, ו-H1 שהוא שונה ממנו. הוא מחושב בשיטה שנקראת יחס Savage-Dickey: משווים את צפיפות הפוסטריורי לצפיפות הפריור, שתיהן בדיוק בערך הייחוס, כלומר בנקודה שמייצגת את H0, הממוצע הארצי.</w:t>
+        <w:t>והוא ענה שהגישה הבייסאנית המקבילה היא פקטור בייס. בעוד שערך המובהקות של המבחן הקלאסי הוא ההסתברות לראות נתונים קיצוניים כאלה בהינתן ש-H0 נכונה בדיוק, פקטור בייס משווה ישירות את העדות בעד H0 מול העדות בעד H1, ומודד כמה פעמים יותר סביר לראות את הנתונים שראינו תחת השערה אחת לעומת השנייה. H0 כאן הוא שאחוז ההצלחה של המחוז שווה לממוצע הארצי, ו-H1 שהוא שונה ממנו. הוא מחושב בשיטה שנקראת יחס Savage-Dickey: משווים את צפיפות הפוסטריורי לצפיפות הפריור, שתיהן בדיוק בערך הייחוס, כלומר בנקודה שמייצגת את H0, הממוצע הארצי.</w:t>
       </w:r>
     </w:p>
     <w:p>
@@ -1014,7 +1014,7 @@
           <w:sz w:val="25"/>
           <w:rtl/>
         </w:rPr>
-        <w:t>והוא הבהיר שהפוסטריורי מתאר את האמון שלנו על הפרמטר עצמו, ואילו התפלגות החיזוי מתארת תחזית לתצפית חדשה, כמו כמה תלמידים היו עוברים אילו בדקנו עוד קבוצה מאותו מחוז. התפלגות החיזוי כוללת גם את אי-הוודאות על הפרמטר וגם את השונות האקראית הרגילה של דגימה חדשה.</w:t>
+        <w:t>והוא הבהיר שהפוסטריורי מתאר את האמון שלנו על הפרמטר עצמו, ואילו התפלגות החיזוי מתארת תחזית לתצפית חדשה, כמו כמה תלמידים היו עוברים אילו בדקנו עוד קבוצה מאותו מחוז. התפלגות החיזוי כוללת גם את אי-הוודאות על הפרמטר וגם את השונות האקראית הרגילה של דגימה חדשה, ולכן היא תמיד רחבה יותר מהתפלגות דגימה סביב ערך יחיד בלבד של הפרמטר.</w:t>
       </w:r>
     </w:p>
     <w:p>
@@ -1284,6 +1284,23 @@
           <w:sz w:val="25"/>
           <w:rtl/>
         </w:rPr>
+        <w:t>אחרי הדגימה, הממוצע האוכלוסייתי המשותף יוצא סביב 0.38, ופרמטר הריכוז יוצא סביב 9.6. מה זה אומר בפועל? ש-38 אחוז הוא בערך אחוז ההצלחה הטיפוסי שממנו כל המחוזות בקבוצה סוטים, ושהריכוז הקטן יחסית, בהשוואה למחוזות עם מאות או אלפי תלמידים, אומר שהמודל לא בטוח שכל המחוזות דומים מאוד זה לזה: הוא מרשה למחוזות לסטות באופן משמעותי מהממוצע המשותף, לא כופה עליהם להיות כמעט זהים. פרמטר ריכוז גדול הרבה יותר היה אומר שכל המחוזות כמעט זהים וכל סטייה היא רעש בלבד, וזה לא המצב כאן.</w:t>
+      </w:r>
+    </w:p>
+    <w:p>
+      <w:pPr>
+        <w:bidi/>
+        <w:spacing w:after="160" w:before="0"/>
+        <w:jc w:val="both"/>
+      </w:pPr>
+      <w:r>
+        <w:rPr>
+          <w:rFonts w:ascii="David" w:hAnsi="David" w:cs="David" w:eastAsia="David"/>
+          <w:b w:val="0"/>
+          <w:i w:val="0"/>
+          <w:sz w:val="25"/>
+          <w:rtl/>
+        </w:rPr>
         <w:t>שאלתי את הצ'אט למה משתמשים בפרמטריזציה הזאת, ממוצע אוכלוסייתי וריכוז, במקום שני הפרמטרים הרגילים של בטא:</w:t>
       </w:r>
     </w:p>
@@ -1371,24 +1388,7 @@
           <w:sz w:val="25"/>
           <w:rtl/>
         </w:rPr>
-        <w:t>והוא הסביר שהצורה הזאת ניתנת לפירוש ישיר: מיו הוא הממוצע, נו הוא בערך "גודל מדגם דמיוני" שקובע כמה צר הפריור סביב הממוצע. זה מאפשר לשים פריור-על ישירות על הממוצע האוכלוסייתי ועל מידת השונות המותרת בין מחוזות, וזה בדיוק המנגנון שמאפשר זרימת מידע בין המחוזות בזמן הדגימה.</w:t>
-      </w:r>
-    </w:p>
-    <w:p>
-      <w:pPr>
-        <w:bidi/>
-        <w:spacing w:after="160" w:before="0"/>
-        <w:jc w:val="both"/>
-      </w:pPr>
-      <w:r>
-        <w:rPr>
-          <w:rFonts w:ascii="David" w:hAnsi="David" w:cs="David" w:eastAsia="David"/>
-          <w:b w:val="0"/>
-          <w:i w:val="0"/>
-          <w:sz w:val="25"/>
-          <w:rtl/>
-        </w:rPr>
-        <w:t>בפועל, הממוצע האוכלוסייתי המשותף יוצא סביב 0.38, ופרמטר הריכוז יוצא סביב 9.6. מה זה אומר בפועל? ש-38 אחוז הוא בערך אחוז ההצלחה הטיפוסי שממנו כל המחוזות בקבוצה סוטים, ושהריכוז הקטן יחסית, בהשוואה למחוזות עם מאות או אלפי תלמידים, אומר שהמודל לא בטוח שכל המחוזות דומים מאוד זה לזה: הוא מרשה למחוזות לסטות באופן משמעותי מהממוצע המשותף, לא כופה עליהם להיות כמעט זהים. פרמטר ריכוז גדול הרבה יותר היה אומר שכל המחוזות כמעט זהים וכל סטייה היא רעש בלבד, וזה לא המצב כאן.</w:t>
+        <w:t>והוא הסביר שאלפא ובטא לא ניתנים לפירוש ישיר במונחים שקל לחשוב עליהם, ואילו הפרמטריזציה של מיו ונו כן: מיו הוא הממוצע, ונו הוא בערך "גודל מדגם דמיוני" שקובע כמה צר הפריור סביב הממוצע, כך שנו גדול יותר אומר התפלגות צרה יותר. זה מאפשר לשים פריור-על ישירות על הממוצע האוכלוסייתי ועל מידת השונות המותרת בין מחוזות, וזה בדיוק המנגנון שמאפשר זרימת מידע בין המחוזות בזמן הדגימה.</w:t>
       </w:r>
     </w:p>
     <w:p>
@@ -1624,7 +1624,7 @@
           <w:sz w:val="25"/>
           <w:rtl/>
         </w:rPr>
-        <w:t>והוא הסביר שבמודל ההיררכי, אחוזי ההצלחה של המחוזות מכווצים חלקית לכיוון הממוצע המשותף ולא חופשיים לגמרי להתאים את עצמם למחוז שלהם, כך שכל אחד תורם פחות מפרמטר שלם אחד למספר האפקטיבי. המודל ההיררכי יכול להיות בעל יותר פרמטרים על הנייר, כי הוא מוסיף את שני פרמטרי פריור-העל, אבל עם מספר אפקטיבי נמוך יותר מהמודל העצמאי, וזה בדיוק המנגנון שמאפשר לו להכליל טוב יותר. מדדים קלאסיים כמו AIC ו-BIC, שבנויים למודלים עם מספר פרמטרים קבוע וברור, לא יודעים להתמודד עם החישוב הזה, ולכן הם לא הכלי הסטנדרטי להשוואת מודלים בייסאניים היררכיים.</w:t>
+        <w:t>והוא הסביר שהעונש שמחשבים ב-WAIC וב-LOO מודד כמה כל פרמטר בפועל גמיש כדי להתאים את עצמו לנתונים, ולא כמה פרמטרים יש על הנייר. במודל ההיררכי, אחוזי ההצלחה של המחוזות מכווצים חלקית לכיוון הממוצע המשותף ולא חופשיים לגמרי להתאים את עצמם למחוז שלהם, כך שכל אחד תורם בפועל פחות מפרמטר שלם אחד למספר האפקטיבי. המודל ההיררכי יכול להיות בעל יותר פרמטרים על הנייר, כי הוא מוסיף את שני פרמטרי פריור-העל, אבל עם מספר אפקטיבי נמוך יותר מהמודל העצמאי, וזה בדיוק המנגנון שמאפשר לו להכליל טוב יותר. מדדים קלאסיים כמו AIC ו-BIC בנויים למודלים עם מספר פרמטרים חופשיים וקבוע מראש, ולכן אין להם דרך לשקף את הכיווץ הזה, וזאת הסיבה שהם לא הכלי הסטנדרטי להשוואת מודלים בייסאניים היררכיים.</w:t>
       </w:r>
     </w:p>
     <w:p>

</xml_diff>